<commit_message>
Update reduced sparse monkey PK study design
</commit_message>
<xml_diff>
--- a/02_Docs/Manuscript/Draft3.docx
+++ b/02_Docs/Manuscript/Draft3.docx
@@ -475,19 +475,11 @@
       </w:pPr>
       <w:r>
         <w:rPr>
-          <w:rFonts w:asciiTheme="minorHAnsi" w:cstheme="minorBidi" w:eastAsiaTheme="minorHAnsi" w:hAnsiTheme="minorHAnsi"/>
+          <w:rFonts w:eastAsia="Aptos" w:cs="" w:cstheme="minorBidi" w:eastAsiaTheme="minorHAnsi"/>
           <w:shd w:fill="FFFF00" w:val="clear"/>
           <w14:ligatures w14:val="standardContextual"/>
         </w:rPr>
-        <w:t xml:space="preserve">Strengths  - proof of concept, first analysis of PBPK as NAM  - combined with AI and robust in vitro data package. </w:t>
-      </w:r>
-      <w:r>
-        <w:rPr>
-          <w:rFonts w:asciiTheme="minorHAnsi" w:cstheme="minorBidi" w:eastAsiaTheme="minorHAnsi" w:hAnsiTheme="minorHAnsi"/>
-          <w:shd w:fill="FFFF00" w:val="clear"/>
-          <w14:ligatures w14:val="standardContextual"/>
-        </w:rPr>
-        <w:t xml:space="preserve">Our study proof-of-concept and retrospective due to limitation of readily available datasets available in literature; focus on value added; first evals of PBPK as </w:t>
+        <w:t xml:space="preserve">Strengths  - proof of concept, first analysis of PBPK as NAM  - combined with AI and robust in vitro data package. Our study proof-of-concept and retrospective due to limitation of readily available datasets available in literature; focus on value added; first evals of PBPK as </w:t>
       </w:r>
       <w:r>
         <w:rPr>
@@ -668,6 +660,83 @@
           <w:szCs w:val="40"/>
         </w:rPr>
       </w:r>
+    </w:p>
+    <w:p>
+      <w:pPr>
+        <w:pStyle w:val="Normal"/>
+        <w:rPr>
+          <w:rFonts w:ascii="Aptos Display" w:hAnsi="Aptos Display" w:eastAsia="" w:cs="" w:asciiTheme="majorHAnsi" w:cstheme="majorBidi" w:eastAsiaTheme="majorEastAsia" w:hAnsiTheme="majorHAnsi"/>
+          <w:b/>
+          <w:sz w:val="40"/>
+          <w:szCs w:val="40"/>
+        </w:rPr>
+      </w:pPr>
+      <w:r>
+        <w:rPr>
+          <w:rFonts w:eastAsia="" w:cs="" w:cstheme="majorBidi" w:eastAsiaTheme="majorEastAsia" w:ascii="Aptos Display" w:hAnsi="Aptos Display"/>
+          <w:b/>
+          <w:sz w:val="40"/>
+          <w:szCs w:val="40"/>
+        </w:rPr>
+      </w:r>
+      <w:r>
+        <w:br w:type="page"/>
+      </w:r>
+    </w:p>
+    <w:p>
+      <w:pPr>
+        <w:pStyle w:val="Normal"/>
+        <w:spacing w:before="0" w:after="160"/>
+        <w:rPr>
+          <w:rFonts w:ascii="Aptos Display" w:hAnsi="Aptos Display" w:eastAsia="" w:cs="" w:asciiTheme="majorHAnsi" w:cstheme="majorBidi" w:eastAsiaTheme="majorEastAsia" w:hAnsiTheme="majorHAnsi"/>
+          <w:b/>
+          <w:sz w:val="40"/>
+          <w:szCs w:val="40"/>
+        </w:rPr>
+      </w:pPr>
+      <w:r>
+        <w:rPr>
+          <w:rFonts w:eastAsia="Aptos" w:cs="" w:cstheme="minorBidi" w:eastAsiaTheme="minorHAnsi"/>
+          <w:b/>
+          <w:bCs/>
+          <w:color w:val="auto"/>
+          <w:kern w:val="2"/>
+          <w:sz w:val="24"/>
+          <w:szCs w:val="24"/>
+          <w:lang w:val="en-US" w:eastAsia="en-US" w:bidi="ar-SA"/>
+          <w14:ligatures w14:val="standardContextual"/>
+        </w:rPr>
+        <w:t>Figure X.</w:t>
+      </w:r>
+      <w:r>
+        <w:rPr>
+          <w:rFonts w:eastAsia="" w:cs="" w:ascii="Aptos Display" w:hAnsi="Aptos Display" w:asciiTheme="majorHAnsi" w:cstheme="majorBidi" w:eastAsiaTheme="majorEastAsia" w:hAnsiTheme="majorHAnsi"/>
+          <w:b/>
+          <w:bCs/>
+          <w:sz w:val="40"/>
+          <w:szCs w:val="40"/>
+        </w:rPr>
+        <w:t xml:space="preserve"> </w:t>
+      </w:r>
+    </w:p>
+    <w:p>
+      <w:pPr>
+        <w:pStyle w:val="Normal"/>
+        <w:rPr>
+          <w:rFonts w:ascii="Aptos Display" w:hAnsi="Aptos Display" w:eastAsia="" w:cs="" w:asciiTheme="majorHAnsi" w:cstheme="majorBidi" w:eastAsiaTheme="majorEastAsia" w:hAnsiTheme="majorHAnsi"/>
+          <w:b/>
+          <w:sz w:val="40"/>
+          <w:szCs w:val="40"/>
+        </w:rPr>
+      </w:pPr>
+      <w:r>
+        <w:rPr>
+          <w:rFonts w:eastAsia="" w:cs="" w:cstheme="majorBidi" w:eastAsiaTheme="majorEastAsia" w:ascii="Aptos Display" w:hAnsi="Aptos Display"/>
+          <w:b/>
+          <w:sz w:val="40"/>
+          <w:szCs w:val="40"/>
+        </w:rPr>
+      </w:r>
       <w:r>
         <w:br w:type="page"/>
       </w:r>
@@ -724,8 +793,8 @@
         <w:gridCol w:w="1170"/>
         <w:gridCol w:w="1709"/>
         <w:gridCol w:w="1711"/>
-        <w:gridCol w:w="1892"/>
-        <w:gridCol w:w="1797"/>
+        <w:gridCol w:w="1893"/>
+        <w:gridCol w:w="1796"/>
       </w:tblGrid>
       <w:tr>
         <w:trPr>
@@ -991,7 +1060,7 @@
         </w:tc>
         <w:tc>
           <w:tcPr>
-            <w:tcW w:w="1892" w:type="dxa"/>
+            <w:tcW w:w="1893" w:type="dxa"/>
             <w:tcBorders>
               <w:top w:val="single" w:sz="4" w:space="0" w:color="000000"/>
               <w:left w:val="single" w:sz="4" w:space="0" w:color="000000"/>
@@ -1028,7 +1097,7 @@
         </w:tc>
         <w:tc>
           <w:tcPr>
-            <w:tcW w:w="1797" w:type="dxa"/>
+            <w:tcW w:w="1796" w:type="dxa"/>
             <w:tcBorders>
               <w:top w:val="single" w:sz="4" w:space="0" w:color="000000"/>
               <w:left w:val="single" w:sz="4" w:space="0" w:color="000000"/>
@@ -1163,7 +1232,7 @@
         </w:tc>
         <w:tc>
           <w:tcPr>
-            <w:tcW w:w="1892" w:type="dxa"/>
+            <w:tcW w:w="1893" w:type="dxa"/>
             <w:tcBorders>
               <w:top w:val="single" w:sz="4" w:space="0" w:color="000000"/>
               <w:left w:val="single" w:sz="4" w:space="0" w:color="000000"/>
@@ -1188,7 +1257,7 @@
         </w:tc>
         <w:tc>
           <w:tcPr>
-            <w:tcW w:w="1797" w:type="dxa"/>
+            <w:tcW w:w="1796" w:type="dxa"/>
             <w:tcBorders>
               <w:top w:val="single" w:sz="4" w:space="0" w:color="000000"/>
               <w:left w:val="single" w:sz="4" w:space="0" w:color="000000"/>
@@ -1318,7 +1387,7 @@
         </w:tc>
         <w:tc>
           <w:tcPr>
-            <w:tcW w:w="1892" w:type="dxa"/>
+            <w:tcW w:w="1893" w:type="dxa"/>
             <w:tcBorders>
               <w:top w:val="single" w:sz="4" w:space="0" w:color="000000"/>
               <w:left w:val="single" w:sz="4" w:space="0" w:color="000000"/>
@@ -1343,7 +1412,7 @@
         </w:tc>
         <w:tc>
           <w:tcPr>
-            <w:tcW w:w="1797" w:type="dxa"/>
+            <w:tcW w:w="1796" w:type="dxa"/>
             <w:tcBorders>
               <w:top w:val="single" w:sz="4" w:space="0" w:color="000000"/>
               <w:left w:val="single" w:sz="4" w:space="0" w:color="000000"/>
@@ -1473,7 +1542,7 @@
         </w:tc>
         <w:tc>
           <w:tcPr>
-            <w:tcW w:w="1892" w:type="dxa"/>
+            <w:tcW w:w="1893" w:type="dxa"/>
             <w:tcBorders>
               <w:top w:val="single" w:sz="4" w:space="0" w:color="000000"/>
               <w:left w:val="single" w:sz="4" w:space="0" w:color="000000"/>
@@ -1498,7 +1567,7 @@
         </w:tc>
         <w:tc>
           <w:tcPr>
-            <w:tcW w:w="1797" w:type="dxa"/>
+            <w:tcW w:w="1796" w:type="dxa"/>
             <w:tcBorders>
               <w:top w:val="single" w:sz="4" w:space="0" w:color="000000"/>
               <w:left w:val="single" w:sz="4" w:space="0" w:color="000000"/>
@@ -1628,7 +1697,7 @@
         </w:tc>
         <w:tc>
           <w:tcPr>
-            <w:tcW w:w="1892" w:type="dxa"/>
+            <w:tcW w:w="1893" w:type="dxa"/>
             <w:tcBorders>
               <w:top w:val="single" w:sz="4" w:space="0" w:color="000000"/>
               <w:left w:val="single" w:sz="4" w:space="0" w:color="000000"/>
@@ -1653,7 +1722,7 @@
         </w:tc>
         <w:tc>
           <w:tcPr>
-            <w:tcW w:w="1797" w:type="dxa"/>
+            <w:tcW w:w="1796" w:type="dxa"/>
             <w:tcBorders>
               <w:top w:val="single" w:sz="4" w:space="0" w:color="000000"/>
               <w:left w:val="single" w:sz="4" w:space="0" w:color="000000"/>
@@ -1783,7 +1852,7 @@
         </w:tc>
         <w:tc>
           <w:tcPr>
-            <w:tcW w:w="1892" w:type="dxa"/>
+            <w:tcW w:w="1893" w:type="dxa"/>
             <w:tcBorders>
               <w:top w:val="single" w:sz="4" w:space="0" w:color="000000"/>
               <w:left w:val="single" w:sz="4" w:space="0" w:color="000000"/>
@@ -1808,7 +1877,7 @@
         </w:tc>
         <w:tc>
           <w:tcPr>
-            <w:tcW w:w="1797" w:type="dxa"/>
+            <w:tcW w:w="1796" w:type="dxa"/>
             <w:tcBorders>
               <w:top w:val="single" w:sz="4" w:space="0" w:color="000000"/>
               <w:left w:val="single" w:sz="4" w:space="0" w:color="000000"/>
@@ -1938,7 +2007,7 @@
         </w:tc>
         <w:tc>
           <w:tcPr>
-            <w:tcW w:w="1892" w:type="dxa"/>
+            <w:tcW w:w="1893" w:type="dxa"/>
             <w:tcBorders>
               <w:top w:val="single" w:sz="4" w:space="0" w:color="000000"/>
               <w:left w:val="single" w:sz="4" w:space="0" w:color="000000"/>
@@ -1963,7 +2032,7 @@
         </w:tc>
         <w:tc>
           <w:tcPr>
-            <w:tcW w:w="1797" w:type="dxa"/>
+            <w:tcW w:w="1796" w:type="dxa"/>
             <w:tcBorders>
               <w:top w:val="single" w:sz="4" w:space="0" w:color="000000"/>
               <w:left w:val="single" w:sz="4" w:space="0" w:color="000000"/>
@@ -2093,7 +2162,7 @@
         </w:tc>
         <w:tc>
           <w:tcPr>
-            <w:tcW w:w="1892" w:type="dxa"/>
+            <w:tcW w:w="1893" w:type="dxa"/>
             <w:tcBorders>
               <w:top w:val="single" w:sz="4" w:space="0" w:color="000000"/>
               <w:left w:val="single" w:sz="4" w:space="0" w:color="000000"/>
@@ -2118,7 +2187,7 @@
         </w:tc>
         <w:tc>
           <w:tcPr>
-            <w:tcW w:w="1797" w:type="dxa"/>
+            <w:tcW w:w="1796" w:type="dxa"/>
             <w:tcBorders>
               <w:top w:val="single" w:sz="4" w:space="0" w:color="000000"/>
               <w:left w:val="single" w:sz="4" w:space="0" w:color="000000"/>
@@ -2248,7 +2317,7 @@
         </w:tc>
         <w:tc>
           <w:tcPr>
-            <w:tcW w:w="1892" w:type="dxa"/>
+            <w:tcW w:w="1893" w:type="dxa"/>
             <w:tcBorders>
               <w:top w:val="single" w:sz="4" w:space="0" w:color="000000"/>
               <w:left w:val="single" w:sz="4" w:space="0" w:color="000000"/>
@@ -2273,7 +2342,7 @@
         </w:tc>
         <w:tc>
           <w:tcPr>
-            <w:tcW w:w="1797" w:type="dxa"/>
+            <w:tcW w:w="1796" w:type="dxa"/>
             <w:tcBorders>
               <w:top w:val="single" w:sz="4" w:space="0" w:color="000000"/>
               <w:left w:val="single" w:sz="4" w:space="0" w:color="000000"/>
@@ -2403,7 +2472,7 @@
         </w:tc>
         <w:tc>
           <w:tcPr>
-            <w:tcW w:w="1892" w:type="dxa"/>
+            <w:tcW w:w="1893" w:type="dxa"/>
             <w:tcBorders>
               <w:top w:val="single" w:sz="4" w:space="0" w:color="000000"/>
               <w:left w:val="single" w:sz="4" w:space="0" w:color="000000"/>
@@ -2428,7 +2497,7 @@
         </w:tc>
         <w:tc>
           <w:tcPr>
-            <w:tcW w:w="1797" w:type="dxa"/>
+            <w:tcW w:w="1796" w:type="dxa"/>
             <w:tcBorders>
               <w:top w:val="single" w:sz="4" w:space="0" w:color="000000"/>
               <w:left w:val="single" w:sz="4" w:space="0" w:color="000000"/>
@@ -2558,7 +2627,7 @@
         </w:tc>
         <w:tc>
           <w:tcPr>
-            <w:tcW w:w="1892" w:type="dxa"/>
+            <w:tcW w:w="1893" w:type="dxa"/>
             <w:tcBorders>
               <w:top w:val="single" w:sz="4" w:space="0" w:color="000000"/>
               <w:left w:val="single" w:sz="4" w:space="0" w:color="000000"/>
@@ -2583,7 +2652,7 @@
         </w:tc>
         <w:tc>
           <w:tcPr>
-            <w:tcW w:w="1797" w:type="dxa"/>
+            <w:tcW w:w="1796" w:type="dxa"/>
             <w:tcBorders>
               <w:top w:val="single" w:sz="4" w:space="0" w:color="000000"/>
               <w:left w:val="single" w:sz="4" w:space="0" w:color="000000"/>
@@ -2713,7 +2782,7 @@
         </w:tc>
         <w:tc>
           <w:tcPr>
-            <w:tcW w:w="1892" w:type="dxa"/>
+            <w:tcW w:w="1893" w:type="dxa"/>
             <w:tcBorders>
               <w:top w:val="single" w:sz="4" w:space="0" w:color="000000"/>
               <w:left w:val="single" w:sz="4" w:space="0" w:color="000000"/>
@@ -2738,7 +2807,7 @@
         </w:tc>
         <w:tc>
           <w:tcPr>
-            <w:tcW w:w="1797" w:type="dxa"/>
+            <w:tcW w:w="1796" w:type="dxa"/>
             <w:tcBorders>
               <w:top w:val="single" w:sz="4" w:space="0" w:color="000000"/>
               <w:left w:val="single" w:sz="4" w:space="0" w:color="000000"/>
@@ -2868,7 +2937,7 @@
         </w:tc>
         <w:tc>
           <w:tcPr>
-            <w:tcW w:w="1892" w:type="dxa"/>
+            <w:tcW w:w="1893" w:type="dxa"/>
             <w:tcBorders>
               <w:top w:val="single" w:sz="4" w:space="0" w:color="000000"/>
               <w:left w:val="single" w:sz="4" w:space="0" w:color="000000"/>
@@ -2893,7 +2962,7 @@
         </w:tc>
         <w:tc>
           <w:tcPr>
-            <w:tcW w:w="1797" w:type="dxa"/>
+            <w:tcW w:w="1796" w:type="dxa"/>
             <w:tcBorders>
               <w:top w:val="single" w:sz="4" w:space="0" w:color="000000"/>
               <w:left w:val="single" w:sz="4" w:space="0" w:color="000000"/>
@@ -3023,7 +3092,7 @@
         </w:tc>
         <w:tc>
           <w:tcPr>
-            <w:tcW w:w="1892" w:type="dxa"/>
+            <w:tcW w:w="1893" w:type="dxa"/>
             <w:tcBorders>
               <w:top w:val="single" w:sz="4" w:space="0" w:color="000000"/>
               <w:left w:val="single" w:sz="4" w:space="0" w:color="000000"/>
@@ -3048,7 +3117,7 @@
         </w:tc>
         <w:tc>
           <w:tcPr>
-            <w:tcW w:w="1797" w:type="dxa"/>
+            <w:tcW w:w="1796" w:type="dxa"/>
             <w:tcBorders>
               <w:top w:val="single" w:sz="4" w:space="0" w:color="000000"/>
               <w:left w:val="single" w:sz="4" w:space="0" w:color="000000"/>
@@ -3178,7 +3247,7 @@
         </w:tc>
         <w:tc>
           <w:tcPr>
-            <w:tcW w:w="1892" w:type="dxa"/>
+            <w:tcW w:w="1893" w:type="dxa"/>
             <w:tcBorders>
               <w:top w:val="single" w:sz="4" w:space="0" w:color="000000"/>
               <w:left w:val="single" w:sz="4" w:space="0" w:color="000000"/>
@@ -3203,7 +3272,7 @@
         </w:tc>
         <w:tc>
           <w:tcPr>
-            <w:tcW w:w="1797" w:type="dxa"/>
+            <w:tcW w:w="1796" w:type="dxa"/>
             <w:tcBorders>
               <w:top w:val="single" w:sz="4" w:space="0" w:color="000000"/>
               <w:left w:val="single" w:sz="4" w:space="0" w:color="000000"/>
@@ -3273,8 +3342,8 @@
         <w:tblLook w:firstRow="1" w:noVBand="1" w:lastRow="0" w:firstColumn="1" w:lastColumn="0" w:noHBand="0" w:val="04a0"/>
       </w:tblPr>
       <w:tblGrid>
-        <w:gridCol w:w="2175"/>
-        <w:gridCol w:w="1527"/>
+        <w:gridCol w:w="2173"/>
+        <w:gridCol w:w="1529"/>
         <w:gridCol w:w="1613"/>
         <w:gridCol w:w="1614"/>
         <w:gridCol w:w="1613"/>
@@ -3287,7 +3356,7 @@
         </w:trPr>
         <w:tc>
           <w:tcPr>
-            <w:tcW w:w="2175" w:type="dxa"/>
+            <w:tcW w:w="2173" w:type="dxa"/>
             <w:vMerge w:val="restart"/>
             <w:tcBorders>
               <w:top w:val="single" w:sz="4" w:space="0" w:color="000000"/>
@@ -3318,7 +3387,7 @@
         </w:tc>
         <w:tc>
           <w:tcPr>
-            <w:tcW w:w="1527" w:type="dxa"/>
+            <w:tcW w:w="1529" w:type="dxa"/>
             <w:vMerge w:val="restart"/>
             <w:tcBorders>
               <w:top w:val="single" w:sz="4" w:space="0" w:color="000000"/>
@@ -3417,7 +3486,7 @@
         </w:trPr>
         <w:tc>
           <w:tcPr>
-            <w:tcW w:w="2175" w:type="dxa"/>
+            <w:tcW w:w="2173" w:type="dxa"/>
             <w:vMerge w:val="continue"/>
             <w:tcBorders>
               <w:top w:val="single" w:sz="4" w:space="0" w:color="000000"/>
@@ -3447,7 +3516,7 @@
         </w:tc>
         <w:tc>
           <w:tcPr>
-            <w:tcW w:w="1527" w:type="dxa"/>
+            <w:tcW w:w="1529" w:type="dxa"/>
             <w:vMerge w:val="continue"/>
             <w:tcBorders>
               <w:top w:val="single" w:sz="4" w:space="0" w:color="000000"/>
@@ -3616,7 +3685,7 @@
         </w:trPr>
         <w:tc>
           <w:tcPr>
-            <w:tcW w:w="2175" w:type="dxa"/>
+            <w:tcW w:w="2173" w:type="dxa"/>
             <w:tcBorders>
               <w:top w:val="single" w:sz="4" w:space="0" w:color="000000"/>
               <w:left w:val="single" w:sz="4" w:space="0" w:color="000000"/>
@@ -3641,7 +3710,7 @@
         </w:tc>
         <w:tc>
           <w:tcPr>
-            <w:tcW w:w="1527" w:type="dxa"/>
+            <w:tcW w:w="1529" w:type="dxa"/>
             <w:tcBorders>
               <w:top w:val="single" w:sz="4" w:space="0" w:color="000000"/>
               <w:left w:val="single" w:sz="4" w:space="0" w:color="000000"/>
@@ -3771,7 +3840,7 @@
         </w:trPr>
         <w:tc>
           <w:tcPr>
-            <w:tcW w:w="2175" w:type="dxa"/>
+            <w:tcW w:w="2173" w:type="dxa"/>
             <w:tcBorders>
               <w:top w:val="single" w:sz="4" w:space="0" w:color="000000"/>
               <w:left w:val="single" w:sz="4" w:space="0" w:color="000000"/>
@@ -3796,7 +3865,7 @@
         </w:tc>
         <w:tc>
           <w:tcPr>
-            <w:tcW w:w="1527" w:type="dxa"/>
+            <w:tcW w:w="1529" w:type="dxa"/>
             <w:tcBorders>
               <w:top w:val="single" w:sz="4" w:space="0" w:color="000000"/>
               <w:left w:val="single" w:sz="4" w:space="0" w:color="000000"/>
@@ -3926,7 +3995,7 @@
         </w:trPr>
         <w:tc>
           <w:tcPr>
-            <w:tcW w:w="2175" w:type="dxa"/>
+            <w:tcW w:w="2173" w:type="dxa"/>
             <w:tcBorders>
               <w:top w:val="single" w:sz="4" w:space="0" w:color="000000"/>
               <w:left w:val="single" w:sz="4" w:space="0" w:color="000000"/>
@@ -3951,7 +4020,7 @@
         </w:tc>
         <w:tc>
           <w:tcPr>
-            <w:tcW w:w="1527" w:type="dxa"/>
+            <w:tcW w:w="1529" w:type="dxa"/>
             <w:tcBorders>
               <w:top w:val="single" w:sz="4" w:space="0" w:color="000000"/>
               <w:left w:val="single" w:sz="4" w:space="0" w:color="000000"/>
@@ -4081,7 +4150,7 @@
         </w:trPr>
         <w:tc>
           <w:tcPr>
-            <w:tcW w:w="2175" w:type="dxa"/>
+            <w:tcW w:w="2173" w:type="dxa"/>
             <w:tcBorders>
               <w:top w:val="single" w:sz="4" w:space="0" w:color="000000"/>
               <w:left w:val="single" w:sz="4" w:space="0" w:color="000000"/>
@@ -4106,7 +4175,7 @@
         </w:tc>
         <w:tc>
           <w:tcPr>
-            <w:tcW w:w="1527" w:type="dxa"/>
+            <w:tcW w:w="1529" w:type="dxa"/>
             <w:tcBorders>
               <w:top w:val="single" w:sz="4" w:space="0" w:color="000000"/>
               <w:left w:val="single" w:sz="4" w:space="0" w:color="000000"/>
@@ -4236,7 +4305,7 @@
         </w:trPr>
         <w:tc>
           <w:tcPr>
-            <w:tcW w:w="2175" w:type="dxa"/>
+            <w:tcW w:w="2173" w:type="dxa"/>
             <w:tcBorders>
               <w:top w:val="single" w:sz="4" w:space="0" w:color="000000"/>
               <w:left w:val="single" w:sz="4" w:space="0" w:color="000000"/>
@@ -4261,7 +4330,7 @@
         </w:tc>
         <w:tc>
           <w:tcPr>
-            <w:tcW w:w="1527" w:type="dxa"/>
+            <w:tcW w:w="1529" w:type="dxa"/>
             <w:tcBorders>
               <w:top w:val="single" w:sz="4" w:space="0" w:color="000000"/>
               <w:left w:val="single" w:sz="4" w:space="0" w:color="000000"/>
@@ -4391,7 +4460,7 @@
         </w:trPr>
         <w:tc>
           <w:tcPr>
-            <w:tcW w:w="2175" w:type="dxa"/>
+            <w:tcW w:w="2173" w:type="dxa"/>
             <w:tcBorders>
               <w:top w:val="single" w:sz="4" w:space="0" w:color="000000"/>
               <w:left w:val="single" w:sz="4" w:space="0" w:color="000000"/>
@@ -4416,7 +4485,7 @@
         </w:tc>
         <w:tc>
           <w:tcPr>
-            <w:tcW w:w="1527" w:type="dxa"/>
+            <w:tcW w:w="1529" w:type="dxa"/>
             <w:tcBorders>
               <w:top w:val="single" w:sz="4" w:space="0" w:color="000000"/>
               <w:left w:val="single" w:sz="4" w:space="0" w:color="000000"/>
@@ -4546,7 +4615,7 @@
         </w:trPr>
         <w:tc>
           <w:tcPr>
-            <w:tcW w:w="2175" w:type="dxa"/>
+            <w:tcW w:w="2173" w:type="dxa"/>
             <w:tcBorders>
               <w:top w:val="single" w:sz="4" w:space="0" w:color="000000"/>
               <w:left w:val="single" w:sz="4" w:space="0" w:color="000000"/>
@@ -4571,7 +4640,7 @@
         </w:tc>
         <w:tc>
           <w:tcPr>
-            <w:tcW w:w="1527" w:type="dxa"/>
+            <w:tcW w:w="1529" w:type="dxa"/>
             <w:tcBorders>
               <w:top w:val="single" w:sz="4" w:space="0" w:color="000000"/>
               <w:left w:val="single" w:sz="4" w:space="0" w:color="000000"/>
@@ -4701,7 +4770,7 @@
         </w:trPr>
         <w:tc>
           <w:tcPr>
-            <w:tcW w:w="2175" w:type="dxa"/>
+            <w:tcW w:w="2173" w:type="dxa"/>
             <w:tcBorders>
               <w:top w:val="single" w:sz="4" w:space="0" w:color="000000"/>
               <w:left w:val="single" w:sz="4" w:space="0" w:color="000000"/>
@@ -4726,7 +4795,7 @@
         </w:tc>
         <w:tc>
           <w:tcPr>
-            <w:tcW w:w="1527" w:type="dxa"/>
+            <w:tcW w:w="1529" w:type="dxa"/>
             <w:tcBorders>
               <w:top w:val="single" w:sz="4" w:space="0" w:color="000000"/>
               <w:left w:val="single" w:sz="4" w:space="0" w:color="000000"/>
@@ -4856,7 +4925,7 @@
         </w:trPr>
         <w:tc>
           <w:tcPr>
-            <w:tcW w:w="2175" w:type="dxa"/>
+            <w:tcW w:w="2173" w:type="dxa"/>
             <w:tcBorders>
               <w:top w:val="single" w:sz="4" w:space="0" w:color="000000"/>
               <w:left w:val="single" w:sz="4" w:space="0" w:color="000000"/>
@@ -4881,7 +4950,7 @@
         </w:tc>
         <w:tc>
           <w:tcPr>
-            <w:tcW w:w="1527" w:type="dxa"/>
+            <w:tcW w:w="1529" w:type="dxa"/>
             <w:tcBorders>
               <w:top w:val="single" w:sz="4" w:space="0" w:color="000000"/>
               <w:left w:val="single" w:sz="4" w:space="0" w:color="000000"/>
@@ -5011,7 +5080,7 @@
         </w:trPr>
         <w:tc>
           <w:tcPr>
-            <w:tcW w:w="2175" w:type="dxa"/>
+            <w:tcW w:w="2173" w:type="dxa"/>
             <w:tcBorders>
               <w:top w:val="single" w:sz="4" w:space="0" w:color="000000"/>
               <w:left w:val="single" w:sz="4" w:space="0" w:color="000000"/>
@@ -5036,7 +5105,7 @@
         </w:tc>
         <w:tc>
           <w:tcPr>
-            <w:tcW w:w="1527" w:type="dxa"/>
+            <w:tcW w:w="1529" w:type="dxa"/>
             <w:tcBorders>
               <w:top w:val="single" w:sz="4" w:space="0" w:color="000000"/>
               <w:left w:val="single" w:sz="4" w:space="0" w:color="000000"/>
@@ -5166,7 +5235,7 @@
         </w:trPr>
         <w:tc>
           <w:tcPr>
-            <w:tcW w:w="2175" w:type="dxa"/>
+            <w:tcW w:w="2173" w:type="dxa"/>
             <w:tcBorders>
               <w:top w:val="single" w:sz="4" w:space="0" w:color="000000"/>
               <w:left w:val="single" w:sz="4" w:space="0" w:color="000000"/>
@@ -5191,7 +5260,7 @@
         </w:tc>
         <w:tc>
           <w:tcPr>
-            <w:tcW w:w="1527" w:type="dxa"/>
+            <w:tcW w:w="1529" w:type="dxa"/>
             <w:tcBorders>
               <w:top w:val="single" w:sz="4" w:space="0" w:color="000000"/>
               <w:left w:val="single" w:sz="4" w:space="0" w:color="000000"/>
@@ -5321,7 +5390,7 @@
         </w:trPr>
         <w:tc>
           <w:tcPr>
-            <w:tcW w:w="2175" w:type="dxa"/>
+            <w:tcW w:w="2173" w:type="dxa"/>
             <w:tcBorders>
               <w:top w:val="single" w:sz="4" w:space="0" w:color="000000"/>
               <w:left w:val="single" w:sz="4" w:space="0" w:color="000000"/>
@@ -5346,7 +5415,7 @@
         </w:tc>
         <w:tc>
           <w:tcPr>
-            <w:tcW w:w="1527" w:type="dxa"/>
+            <w:tcW w:w="1529" w:type="dxa"/>
             <w:tcBorders>
               <w:top w:val="single" w:sz="4" w:space="0" w:color="000000"/>
               <w:left w:val="single" w:sz="4" w:space="0" w:color="000000"/>
@@ -5476,7 +5545,7 @@
         </w:trPr>
         <w:tc>
           <w:tcPr>
-            <w:tcW w:w="2175" w:type="dxa"/>
+            <w:tcW w:w="2173" w:type="dxa"/>
             <w:tcBorders>
               <w:top w:val="single" w:sz="4" w:space="0" w:color="000000"/>
               <w:left w:val="single" w:sz="4" w:space="0" w:color="000000"/>
@@ -5501,7 +5570,7 @@
         </w:tc>
         <w:tc>
           <w:tcPr>
-            <w:tcW w:w="1527" w:type="dxa"/>
+            <w:tcW w:w="1529" w:type="dxa"/>
             <w:tcBorders>
               <w:top w:val="single" w:sz="4" w:space="0" w:color="000000"/>
               <w:left w:val="single" w:sz="4" w:space="0" w:color="000000"/>
@@ -5631,7 +5700,7 @@
         </w:trPr>
         <w:tc>
           <w:tcPr>
-            <w:tcW w:w="2175" w:type="dxa"/>
+            <w:tcW w:w="2173" w:type="dxa"/>
             <w:tcBorders>
               <w:top w:val="single" w:sz="4" w:space="0" w:color="000000"/>
               <w:left w:val="single" w:sz="4" w:space="0" w:color="000000"/>
@@ -5656,7 +5725,7 @@
         </w:tc>
         <w:tc>
           <w:tcPr>
-            <w:tcW w:w="1527" w:type="dxa"/>
+            <w:tcW w:w="1529" w:type="dxa"/>
             <w:tcBorders>
               <w:top w:val="single" w:sz="4" w:space="0" w:color="000000"/>
               <w:left w:val="single" w:sz="4" w:space="0" w:color="000000"/>
@@ -5786,7 +5855,7 @@
         </w:trPr>
         <w:tc>
           <w:tcPr>
-            <w:tcW w:w="2175" w:type="dxa"/>
+            <w:tcW w:w="2173" w:type="dxa"/>
             <w:tcBorders>
               <w:top w:val="single" w:sz="4" w:space="0" w:color="000000"/>
               <w:left w:val="single" w:sz="4" w:space="0" w:color="000000"/>
@@ -5811,7 +5880,7 @@
         </w:tc>
         <w:tc>
           <w:tcPr>
-            <w:tcW w:w="1527" w:type="dxa"/>
+            <w:tcW w:w="1529" w:type="dxa"/>
             <w:tcBorders>
               <w:top w:val="single" w:sz="4" w:space="0" w:color="000000"/>
               <w:left w:val="single" w:sz="4" w:space="0" w:color="000000"/>
@@ -5941,7 +6010,7 @@
         </w:trPr>
         <w:tc>
           <w:tcPr>
-            <w:tcW w:w="2175" w:type="dxa"/>
+            <w:tcW w:w="2173" w:type="dxa"/>
             <w:tcBorders>
               <w:top w:val="single" w:sz="4" w:space="0" w:color="000000"/>
               <w:left w:val="single" w:sz="4" w:space="0" w:color="000000"/>
@@ -5966,7 +6035,7 @@
         </w:tc>
         <w:tc>
           <w:tcPr>
-            <w:tcW w:w="1527" w:type="dxa"/>
+            <w:tcW w:w="1529" w:type="dxa"/>
             <w:tcBorders>
               <w:top w:val="single" w:sz="4" w:space="0" w:color="000000"/>
               <w:left w:val="single" w:sz="4" w:space="0" w:color="000000"/>
@@ -6096,7 +6165,7 @@
         </w:trPr>
         <w:tc>
           <w:tcPr>
-            <w:tcW w:w="2175" w:type="dxa"/>
+            <w:tcW w:w="2173" w:type="dxa"/>
             <w:tcBorders>
               <w:top w:val="single" w:sz="4" w:space="0" w:color="000000"/>
               <w:left w:val="single" w:sz="4" w:space="0" w:color="000000"/>
@@ -6121,7 +6190,7 @@
         </w:tc>
         <w:tc>
           <w:tcPr>
-            <w:tcW w:w="1527" w:type="dxa"/>
+            <w:tcW w:w="1529" w:type="dxa"/>
             <w:tcBorders>
               <w:top w:val="single" w:sz="4" w:space="0" w:color="000000"/>
               <w:left w:val="single" w:sz="4" w:space="0" w:color="000000"/>
@@ -6251,7 +6320,7 @@
         </w:trPr>
         <w:tc>
           <w:tcPr>
-            <w:tcW w:w="2175" w:type="dxa"/>
+            <w:tcW w:w="2173" w:type="dxa"/>
             <w:tcBorders>
               <w:top w:val="single" w:sz="4" w:space="0" w:color="000000"/>
               <w:left w:val="single" w:sz="4" w:space="0" w:color="000000"/>
@@ -6276,7 +6345,7 @@
         </w:tc>
         <w:tc>
           <w:tcPr>
-            <w:tcW w:w="1527" w:type="dxa"/>
+            <w:tcW w:w="1529" w:type="dxa"/>
             <w:tcBorders>
               <w:top w:val="single" w:sz="4" w:space="0" w:color="000000"/>
               <w:left w:val="single" w:sz="4" w:space="0" w:color="000000"/>
@@ -6406,7 +6475,7 @@
         </w:trPr>
         <w:tc>
           <w:tcPr>
-            <w:tcW w:w="2175" w:type="dxa"/>
+            <w:tcW w:w="2173" w:type="dxa"/>
             <w:tcBorders>
               <w:top w:val="single" w:sz="4" w:space="0" w:color="000000"/>
               <w:left w:val="single" w:sz="4" w:space="0" w:color="000000"/>
@@ -6431,7 +6500,7 @@
         </w:tc>
         <w:tc>
           <w:tcPr>
-            <w:tcW w:w="1527" w:type="dxa"/>
+            <w:tcW w:w="1529" w:type="dxa"/>
             <w:tcBorders>
               <w:top w:val="single" w:sz="4" w:space="0" w:color="000000"/>
               <w:left w:val="single" w:sz="4" w:space="0" w:color="000000"/>
@@ -6561,7 +6630,7 @@
         </w:trPr>
         <w:tc>
           <w:tcPr>
-            <w:tcW w:w="2175" w:type="dxa"/>
+            <w:tcW w:w="2173" w:type="dxa"/>
             <w:tcBorders>
               <w:top w:val="single" w:sz="4" w:space="0" w:color="000000"/>
               <w:left w:val="single" w:sz="4" w:space="0" w:color="000000"/>
@@ -6586,7 +6655,7 @@
         </w:tc>
         <w:tc>
           <w:tcPr>
-            <w:tcW w:w="1527" w:type="dxa"/>
+            <w:tcW w:w="1529" w:type="dxa"/>
             <w:tcBorders>
               <w:top w:val="single" w:sz="4" w:space="0" w:color="000000"/>
               <w:left w:val="single" w:sz="4" w:space="0" w:color="000000"/>
@@ -6716,7 +6785,7 @@
         </w:trPr>
         <w:tc>
           <w:tcPr>
-            <w:tcW w:w="2175" w:type="dxa"/>
+            <w:tcW w:w="2173" w:type="dxa"/>
             <w:tcBorders>
               <w:top w:val="single" w:sz="4" w:space="0" w:color="000000"/>
               <w:left w:val="single" w:sz="4" w:space="0" w:color="000000"/>
@@ -6741,7 +6810,7 @@
         </w:tc>
         <w:tc>
           <w:tcPr>
-            <w:tcW w:w="1527" w:type="dxa"/>
+            <w:tcW w:w="1529" w:type="dxa"/>
             <w:tcBorders>
               <w:top w:val="single" w:sz="4" w:space="0" w:color="000000"/>
               <w:left w:val="single" w:sz="4" w:space="0" w:color="000000"/>
@@ -6871,7 +6940,7 @@
         </w:trPr>
         <w:tc>
           <w:tcPr>
-            <w:tcW w:w="2175" w:type="dxa"/>
+            <w:tcW w:w="2173" w:type="dxa"/>
             <w:tcBorders>
               <w:top w:val="single" w:sz="4" w:space="0" w:color="000000"/>
               <w:left w:val="single" w:sz="4" w:space="0" w:color="000000"/>
@@ -6896,7 +6965,7 @@
         </w:tc>
         <w:tc>
           <w:tcPr>
-            <w:tcW w:w="1527" w:type="dxa"/>
+            <w:tcW w:w="1529" w:type="dxa"/>
             <w:tcBorders>
               <w:top w:val="single" w:sz="4" w:space="0" w:color="000000"/>
               <w:left w:val="single" w:sz="4" w:space="0" w:color="000000"/>
@@ -7026,7 +7095,7 @@
         </w:trPr>
         <w:tc>
           <w:tcPr>
-            <w:tcW w:w="2175" w:type="dxa"/>
+            <w:tcW w:w="2173" w:type="dxa"/>
             <w:tcBorders>
               <w:top w:val="single" w:sz="4" w:space="0" w:color="000000"/>
               <w:left w:val="single" w:sz="4" w:space="0" w:color="000000"/>
@@ -7051,7 +7120,7 @@
         </w:tc>
         <w:tc>
           <w:tcPr>
-            <w:tcW w:w="1527" w:type="dxa"/>
+            <w:tcW w:w="1529" w:type="dxa"/>
             <w:tcBorders>
               <w:top w:val="single" w:sz="4" w:space="0" w:color="000000"/>
               <w:left w:val="single" w:sz="4" w:space="0" w:color="000000"/>
@@ -7181,7 +7250,7 @@
         </w:trPr>
         <w:tc>
           <w:tcPr>
-            <w:tcW w:w="2175" w:type="dxa"/>
+            <w:tcW w:w="2173" w:type="dxa"/>
             <w:tcBorders>
               <w:top w:val="single" w:sz="4" w:space="0" w:color="000000"/>
               <w:left w:val="single" w:sz="4" w:space="0" w:color="000000"/>
@@ -7206,7 +7275,7 @@
         </w:tc>
         <w:tc>
           <w:tcPr>
-            <w:tcW w:w="1527" w:type="dxa"/>
+            <w:tcW w:w="1529" w:type="dxa"/>
             <w:tcBorders>
               <w:top w:val="single" w:sz="4" w:space="0" w:color="000000"/>
               <w:left w:val="single" w:sz="4" w:space="0" w:color="000000"/>
@@ -7336,7 +7405,7 @@
         </w:trPr>
         <w:tc>
           <w:tcPr>
-            <w:tcW w:w="2175" w:type="dxa"/>
+            <w:tcW w:w="2173" w:type="dxa"/>
             <w:tcBorders>
               <w:top w:val="single" w:sz="4" w:space="0" w:color="000000"/>
               <w:left w:val="single" w:sz="4" w:space="0" w:color="000000"/>
@@ -7361,7 +7430,7 @@
         </w:tc>
         <w:tc>
           <w:tcPr>
-            <w:tcW w:w="1527" w:type="dxa"/>
+            <w:tcW w:w="1529" w:type="dxa"/>
             <w:tcBorders>
               <w:top w:val="single" w:sz="4" w:space="0" w:color="000000"/>
               <w:left w:val="single" w:sz="4" w:space="0" w:color="000000"/>
@@ -7491,7 +7560,7 @@
         </w:trPr>
         <w:tc>
           <w:tcPr>
-            <w:tcW w:w="2175" w:type="dxa"/>
+            <w:tcW w:w="2173" w:type="dxa"/>
             <w:tcBorders>
               <w:top w:val="single" w:sz="4" w:space="0" w:color="000000"/>
               <w:left w:val="single" w:sz="4" w:space="0" w:color="000000"/>
@@ -7516,7 +7585,7 @@
         </w:tc>
         <w:tc>
           <w:tcPr>
-            <w:tcW w:w="1527" w:type="dxa"/>
+            <w:tcW w:w="1529" w:type="dxa"/>
             <w:tcBorders>
               <w:top w:val="single" w:sz="4" w:space="0" w:color="000000"/>
               <w:left w:val="single" w:sz="4" w:space="0" w:color="000000"/>
@@ -7646,7 +7715,7 @@
         </w:trPr>
         <w:tc>
           <w:tcPr>
-            <w:tcW w:w="2175" w:type="dxa"/>
+            <w:tcW w:w="2173" w:type="dxa"/>
             <w:tcBorders>
               <w:top w:val="single" w:sz="4" w:space="0" w:color="000000"/>
               <w:left w:val="single" w:sz="4" w:space="0" w:color="000000"/>
@@ -7671,7 +7740,7 @@
         </w:tc>
         <w:tc>
           <w:tcPr>
-            <w:tcW w:w="1527" w:type="dxa"/>
+            <w:tcW w:w="1529" w:type="dxa"/>
             <w:tcBorders>
               <w:top w:val="single" w:sz="4" w:space="0" w:color="000000"/>
               <w:left w:val="single" w:sz="4" w:space="0" w:color="000000"/>
@@ -7801,7 +7870,7 @@
         </w:trPr>
         <w:tc>
           <w:tcPr>
-            <w:tcW w:w="2175" w:type="dxa"/>
+            <w:tcW w:w="2173" w:type="dxa"/>
             <w:tcBorders>
               <w:top w:val="single" w:sz="4" w:space="0" w:color="000000"/>
               <w:left w:val="single" w:sz="4" w:space="0" w:color="000000"/>
@@ -7833,7 +7902,7 @@
         </w:tc>
         <w:tc>
           <w:tcPr>
-            <w:tcW w:w="1527" w:type="dxa"/>
+            <w:tcW w:w="1529" w:type="dxa"/>
             <w:tcBorders>
               <w:top w:val="single" w:sz="4" w:space="0" w:color="000000"/>
               <w:left w:val="single" w:sz="4" w:space="0" w:color="000000"/>
@@ -7998,7 +8067,7 @@
         </w:trPr>
         <w:tc>
           <w:tcPr>
-            <w:tcW w:w="2175" w:type="dxa"/>
+            <w:tcW w:w="2173" w:type="dxa"/>
             <w:tcBorders>
               <w:left w:val="single" w:sz="4" w:space="0" w:color="000000"/>
               <w:bottom w:val="single" w:sz="4" w:space="0" w:color="000000"/>
@@ -8029,7 +8098,7 @@
         </w:tc>
         <w:tc>
           <w:tcPr>
-            <w:tcW w:w="1527" w:type="dxa"/>
+            <w:tcW w:w="1529" w:type="dxa"/>
             <w:tcBorders>
               <w:left w:val="single" w:sz="4" w:space="0" w:color="000000"/>
               <w:bottom w:val="single" w:sz="4" w:space="0" w:color="000000"/>
@@ -8188,7 +8257,7 @@
         </w:trPr>
         <w:tc>
           <w:tcPr>
-            <w:tcW w:w="2175" w:type="dxa"/>
+            <w:tcW w:w="2173" w:type="dxa"/>
             <w:tcBorders>
               <w:left w:val="single" w:sz="4" w:space="0" w:color="000000"/>
               <w:bottom w:val="single" w:sz="4" w:space="0" w:color="000000"/>
@@ -8212,7 +8281,7 @@
         </w:tc>
         <w:tc>
           <w:tcPr>
-            <w:tcW w:w="1527" w:type="dxa"/>
+            <w:tcW w:w="1529" w:type="dxa"/>
             <w:tcBorders>
               <w:left w:val="single" w:sz="4" w:space="0" w:color="000000"/>
               <w:bottom w:val="single" w:sz="4" w:space="0" w:color="000000"/>

</xml_diff>